<commit_message>
fix: rebase economic-viability analysis on real paid pricing, drop free-tier dependency
User direction: the plan must reflect real deployment economics, not
promotional pricing. All materials now compute LLM cost from actual paid
tiers; current free promotion is noted honestly but NOT counted in.

- Pricing basis: GLM-4-Flash historical list price ¥0.06-0.1/M tok,
  conservative tier ¥1/M tok (baseline), stress tier ¥5/M tok
- Plan A monthly bill: ¥15-35 -> ¥210-230 (server + conservative API)
- SaaS margin restated: ~44% conservative / ~88% historical-list tier
- Slides 17/18 rebuilt + doc §1/2.2/3/4.2/7/8/9 regenerated (7 pages,
  visually accepted), narration seg18 re-recorded, video rebuilt 16:18
- README economics section synced
</commit_message>
<xml_diff>
--- a/docs/智问校园CampusMind经济适用型与运营方案.docx
+++ b/docs/智问校园CampusMind经济适用型与运营方案.docx
@@ -85,7 +85,7 @@
           <w:b w:val="0"/>
           <w:sz w:val="21"/>
         </w:rPr>
-        <w:t>本方案所有数字分三类,均如实标注:① 实测数字来自本项目可复现脚本(scripts/bench.py、eval_matrix.py,2026-09-18 运行);② 外部价格为 2026 年 10 月查询的公开市场价/新用户活动价,存在波动与续费涨价风险,以官方页面为准;③ 商业定价(SaaS 订阅价、买断价)为商业假设示例,不是承诺。三者不混用、不夸大。</w:t>
+        <w:t>本方案所有数字分三类,均如实标注:① 实测数字来自本项目可复现脚本(scripts/bench.py、eval_matrix.py,2026-09-18 运行);② 外部价格为 2026 年 10 月查询的公开市场价/新用户活动价,存在波动与续费涨价风险,以官方页面为准;③ 商业定价(SaaS 订阅价、买断价)为商业假设示例,不是承诺。此外,大模型调用成本一律按真实收费价核算,不依赖任何限时免费活动(现行免费活动仅作如实备注、未计入方案)。四者不混用、不夸大。</w:t>
       </w:r>
     </w:p>
     <w:p>
@@ -114,7 +114,7 @@
           <w:b w:val="0"/>
           <w:sz w:val="24"/>
         </w:rPr>
-        <w:t>本系统的全部架构决策(生成端插件化、本地抽取式兜底、内存索引热更新、模块化单体)共同导向一个经济结论:默认链路 0 GPU、0 强制 API 费用,一台入门级云服务器即可承载一所高校的日常问答量。这使得系统可以以极低的边际成本售卖和运营——免费版几乎零成本获客,付费版在服务器租金量级的成本上构建毛利。</w:t>
+        <w:t>本系统的全部架构决策(生成端插件化、本地抽取式兜底、内存索引热更新、模块化单体)共同导向一个经济结论:默认链路 0 GPU,云端生成按真实收费价核算在保守档下也仅约两百元/月,一台入门级云服务器即可承载一所高校的日常问答量。这使得系统可以以可控的、可预测的边际成本售卖和运营——免费版靠本地抽取式生成真正零成本获客,付费版在数百元月成本上构建毛利,且任何情况下可切回本地生成,成本存在硬上限。</w:t>
       </w:r>
     </w:p>
     <w:p>
@@ -271,7 +271,7 @@
                 <w:b w:val="0"/>
                 <w:sz w:val="21"/>
               </w:rPr>
-              <w:t>默认生成模型</w:t>
+              <w:t>云端生成模型按量计费(保守档)</w:t>
             </w:r>
           </w:p>
         </w:tc>
@@ -287,7 +287,7 @@
                 <w:b w:val="0"/>
                 <w:sz w:val="21"/>
               </w:rPr>
-              <w:t>GLM-4-Flash(128K),限时免费</w:t>
+              <w:t>¥1/百万 token → 日均 5,000 问 ≈¥195/月</w:t>
             </w:r>
           </w:p>
         </w:tc>
@@ -303,7 +303,7 @@
                 <w:b w:val="0"/>
                 <w:sz w:val="21"/>
               </w:rPr>
-              <w:t>智谱开放平台,2026-10 查证</w:t>
+              <w:t>公开定价档位 × 代码 token 估算</w:t>
             </w:r>
           </w:p>
         </w:tc>
@@ -562,7 +562,7 @@
                 <w:b w:val="0"/>
                 <w:sz w:val="21"/>
               </w:rPr>
-              <w:t>1 台轻量服务器+免费模型档,≈¥15–35/月</w:t>
+              <w:t>服务器 + 按量 API(保守价),≈¥210–230/月</w:t>
             </w:r>
           </w:p>
         </w:tc>
@@ -760,7 +760,7 @@
           <w:b w:val="0"/>
           <w:sz w:val="24"/>
         </w:rPr>
-        <w:t>SaaS 年费 ¥4,999 对应我方直接成本约 ¥180–420/年(服务器 ¥165–379/年+ 域名证书 ≈¥60/年),免费模型档下毛利率约 90%;即使大模型恢复收费(见 §4 敏感性测算,日均 5,000 问 ≈¥195/月),毛利率仍约 44%,定价有安全垫。私有化买断价对标同类校园知识库项目人天实施费(约 15–25 人天)。</w:t>
+        <w:t>SaaS 年费 ¥4,999 对应我方直接成本约 ¥2,520–2,760/年(服务器 ¥165–379/年+ 域名证书 ≈¥60/年 + 保守档 API ≈¥2,340/年,按日均 5,000 问、¥1/百万 token),毛利率约 44%;若大模型处于历史挂牌价档(GLM-4-Flash 付费时期 ¥0.06–0.1/百万 token),API 仅 ≈¥144–240/年,毛利率升至约 88%。两档真实价位下定价均有安全垫,方案不依赖任何限时免费活动。私有化买断价对标同类校园知识库项目人天实施费(约 15–25 人天)。</w:t>
       </w:r>
     </w:p>
     <w:p>
@@ -953,7 +953,7 @@
                 <w:b w:val="0"/>
                 <w:sz w:val="19"/>
               </w:rPr>
-              <w:t>GLM-4-Flash 限时免费;embedding-3 仅索引重建时调用 ≈¥0.01/次</w:t>
+              <w:t>GLM 按量计费,保守档 ¥1/百万 token(日均 5,000 问 ≈¥195/月);embedding-3 重建 ≈¥0.01/次</w:t>
             </w:r>
           </w:p>
         </w:tc>
@@ -968,7 +968,7 @@
                 <w:b w:val="0"/>
                 <w:sz w:val="19"/>
               </w:rPr>
-              <w:t>≈ ¥15–35/月</w:t>
+              <w:t>≈ ¥210–230/月</w:t>
             </w:r>
           </w:p>
         </w:tc>
@@ -1577,7 +1577,7 @@
           <w:b/>
           <w:sz w:val="26"/>
         </w:rPr>
-        <w:t>4.2 生成端成本敏感性</w:t>
+        <w:t>4.2 生成端成本:真实收费价三档</w:t>
       </w:r>
     </w:p>
     <w:tbl>
@@ -1600,7 +1600,7 @@
         </w:trPr>
         <w:tc>
           <w:tcPr>
-            <w:tcW w:type="dxa" w:w="2835"/>
+            <w:tcW w:type="dxa" w:w="3515"/>
             <w:shd w:fill="E9EDFF"/>
           </w:tcPr>
           <w:p>
@@ -1613,26 +1613,7 @@
                 <w:b/>
                 <w:sz w:val="21"/>
               </w:rPr>
-              <w:t>情形</w:t>
-            </w:r>
-          </w:p>
-        </w:tc>
-        <w:tc>
-          <w:tcPr>
-            <w:tcW w:type="dxa" w:w="1928"/>
-            <w:shd w:fill="E9EDFF"/>
-          </w:tcPr>
-          <w:p>
-            <w:pPr>
-              <w:jc w:val="center"/>
-            </w:pPr>
-            <w:r>
-              <w:rPr>
-                <w:rFonts w:ascii="Times New Roman" w:hAnsi="Times New Roman" w:eastAsia="黑体"/>
-                <w:b/>
-                <w:sz w:val="21"/>
-              </w:rPr>
-              <w:t>单价假设</w:t>
+              <w:t>计价情景</w:t>
             </w:r>
           </w:p>
         </w:tc>
@@ -1651,13 +1632,32 @@
                 <w:b/>
                 <w:sz w:val="21"/>
               </w:rPr>
+              <w:t>单价</w:t>
+            </w:r>
+          </w:p>
+        </w:tc>
+        <w:tc>
+          <w:tcPr>
+            <w:tcW w:type="dxa" w:w="1474"/>
+            <w:shd w:fill="E9EDFF"/>
+          </w:tcPr>
+          <w:p>
+            <w:pPr>
+              <w:jc w:val="center"/>
+            </w:pPr>
+            <w:r>
+              <w:rPr>
+                <w:rFonts w:ascii="Times New Roman" w:hAnsi="Times New Roman" w:eastAsia="黑体"/>
+                <w:b/>
+                <w:sz w:val="21"/>
+              </w:rPr>
               <w:t>每问成本</w:t>
             </w:r>
           </w:p>
         </w:tc>
         <w:tc>
           <w:tcPr>
-            <w:tcW w:type="dxa" w:w="2494"/>
+            <w:tcW w:type="dxa" w:w="2268"/>
             <w:shd w:fill="E9EDFF"/>
           </w:tcPr>
           <w:p>
@@ -1681,7 +1681,7 @@
         </w:trPr>
         <w:tc>
           <w:tcPr>
-            <w:tcW w:type="dxa" w:w="2835"/>
+            <w:tcW w:type="dxa" w:w="3515"/>
           </w:tcPr>
           <w:p>
             <w:r>
@@ -1690,22 +1690,7 @@
                 <w:b w:val="0"/>
                 <w:sz w:val="21"/>
               </w:rPr>
-              <w:t>GLM-4-Flash 限时免费(现行)</w:t>
-            </w:r>
-          </w:p>
-        </w:tc>
-        <w:tc>
-          <w:tcPr>
-            <w:tcW w:type="dxa" w:w="1928"/>
-          </w:tcPr>
-          <w:p>
-            <w:r>
-              <w:rPr>
-                <w:rFonts w:ascii="Times New Roman" w:hAnsi="Times New Roman" w:eastAsia="宋体"/>
-                <w:b w:val="0"/>
-                <w:sz w:val="21"/>
-              </w:rPr>
-              <w:t>¥0</w:t>
+              <w:t>历史挂牌价档(GLM-4-Flash 付费时期公开价)</w:t>
             </w:r>
           </w:p>
         </w:tc>
@@ -1720,13 +1705,13 @@
                 <w:b w:val="0"/>
                 <w:sz w:val="21"/>
               </w:rPr>
-              <w:t>¥0</w:t>
+              <w:t>¥0.06–0.1 / 百万 token</w:t>
             </w:r>
           </w:p>
         </w:tc>
         <w:tc>
           <w:tcPr>
-            <w:tcW w:type="dxa" w:w="2494"/>
+            <w:tcW w:type="dxa" w:w="1474"/>
           </w:tcPr>
           <w:p>
             <w:r>
@@ -1735,7 +1720,22 @@
                 <w:b w:val="0"/>
                 <w:sz w:val="21"/>
               </w:rPr>
-              <w:t>¥0</w:t>
+              <w:t>≈¥0.0001</w:t>
+            </w:r>
+          </w:p>
+        </w:tc>
+        <w:tc>
+          <w:tcPr>
+            <w:tcW w:type="dxa" w:w="2268"/>
+          </w:tcPr>
+          <w:p>
+            <w:r>
+              <w:rPr>
+                <w:rFonts w:ascii="Times New Roman" w:hAnsi="Times New Roman" w:eastAsia="宋体"/>
+                <w:b w:val="0"/>
+                <w:sz w:val="21"/>
+              </w:rPr>
+              <w:t>≈¥12–20/月</w:t>
             </w:r>
           </w:p>
         </w:tc>
@@ -1746,7 +1746,7 @@
         </w:trPr>
         <w:tc>
           <w:tcPr>
-            <w:tcW w:type="dxa" w:w="2835"/>
+            <w:tcW w:type="dxa" w:w="3515"/>
             <w:shd w:fill="F7F8FC"/>
           </w:tcPr>
           <w:p>
@@ -1756,13 +1756,13 @@
                 <w:b w:val="0"/>
                 <w:sz w:val="21"/>
               </w:rPr>
-              <w:t>轻度收费假设</w:t>
+              <w:t>保守档(方案基准,当代主力模型价位)</w:t>
             </w:r>
           </w:p>
         </w:tc>
         <w:tc>
           <w:tcPr>
-            <w:tcW w:type="dxa" w:w="1928"/>
+            <w:tcW w:type="dxa" w:w="1814"/>
             <w:shd w:fill="F7F8FC"/>
           </w:tcPr>
           <w:p>
@@ -1778,7 +1778,7 @@
         </w:tc>
         <w:tc>
           <w:tcPr>
-            <w:tcW w:type="dxa" w:w="1814"/>
+            <w:tcW w:type="dxa" w:w="1474"/>
             <w:shd w:fill="F7F8FC"/>
           </w:tcPr>
           <w:p>
@@ -1794,7 +1794,7 @@
         </w:tc>
         <w:tc>
           <w:tcPr>
-            <w:tcW w:type="dxa" w:w="2494"/>
+            <w:tcW w:type="dxa" w:w="2268"/>
             <w:shd w:fill="F7F8FC"/>
           </w:tcPr>
           <w:p>
@@ -1815,7 +1815,7 @@
         </w:trPr>
         <w:tc>
           <w:tcPr>
-            <w:tcW w:type="dxa" w:w="2835"/>
+            <w:tcW w:type="dxa" w:w="3515"/>
           </w:tcPr>
           <w:p>
             <w:r>
@@ -1824,13 +1824,13 @@
                 <w:b w:val="0"/>
                 <w:sz w:val="21"/>
               </w:rPr>
-              <w:t>重度收费假设</w:t>
+              <w:t>压力上限档</w:t>
             </w:r>
           </w:p>
         </w:tc>
         <w:tc>
           <w:tcPr>
-            <w:tcW w:type="dxa" w:w="1928"/>
+            <w:tcW w:type="dxa" w:w="1814"/>
           </w:tcPr>
           <w:p>
             <w:r>
@@ -1845,7 +1845,7 @@
         </w:tc>
         <w:tc>
           <w:tcPr>
-            <w:tcW w:type="dxa" w:w="1814"/>
+            <w:tcW w:type="dxa" w:w="1474"/>
           </w:tcPr>
           <w:p>
             <w:r>
@@ -1860,7 +1860,7 @@
         </w:tc>
         <w:tc>
           <w:tcPr>
-            <w:tcW w:type="dxa" w:w="2494"/>
+            <w:tcW w:type="dxa" w:w="2268"/>
           </w:tcPr>
           <w:p>
             <w:r>
@@ -1882,6 +1882,20 @@
     </w:p>
     <w:p>
       <w:pPr>
+        <w:spacing w:after="160"/>
+      </w:pPr>
+      <w:r>
+        <w:rPr>
+          <w:rFonts w:ascii="Times New Roman" w:hAnsi="Times New Roman" w:eastAsia="宋体"/>
+          <w:b w:val="0"/>
+          <w:color w:val="6A7390"/>
+          <w:sz w:val="20"/>
+        </w:rPr>
+        <w:t>现行官方对 GLM-4-Flash 有限时免费活动,本方案未计入该优惠,一律按常态收费价核算;免费活动若持续仅为额外安全垫。</w:t>
+      </w:r>
+    </w:p>
+    <w:p>
+      <w:pPr>
         <w:spacing w:after="120" w:line="324" w:lineRule="auto"/>
         <w:ind w:firstLine="480"/>
       </w:pPr>
@@ -1891,7 +1905,7 @@
           <w:b w:val="0"/>
           <w:sz w:val="24"/>
         </w:rPr>
-        <w:t>即使重度收费假设下,SaaS 定价仍有毛利(§2.2);且系统可随时切回本地抽取式生成(验收 A1 的降级路径),成本上限可控——这是「双模生成架构」在商业上的直接价值:API 价格波动不构成经营风险。</w:t>
+        <w:t>三档真实价位下 SaaS 定价均有毛利(§2.2 给出基准档与历史档测算);且系统可随时切回本地抽取式生成(验收 A1 的降级路径),成本存在硬上限——这是「双模生成架构」在商业上的直接价值:API 价格波动不构成经营风险。</w:t>
       </w:r>
     </w:p>
     <w:p>
@@ -2950,7 +2964,7 @@
           <w:color w:val="3B5BFD"/>
           <w:sz w:val="32"/>
         </w:rPr>
-        <w:t>7  运营成本模型:SaaS 单校月度损益示例</w:t>
+        <w:t>7  运营成本模型:SaaS 单校月度损益示例(真实收费价)</w:t>
       </w:r>
     </w:p>
     <w:tbl>
@@ -3004,7 +3018,7 @@
                 <w:b/>
                 <w:sz w:val="21"/>
               </w:rPr>
-              <w:t>免费模型档(现行)</w:t>
+              <w:t>历史挂牌价档(¥0.06–0.1/百万)</w:t>
             </w:r>
           </w:p>
         </w:tc>
@@ -3023,7 +3037,7 @@
                 <w:b/>
                 <w:sz w:val="21"/>
               </w:rPr>
-              <w:t>收费假设档(¥1/百万 token)</w:t>
+              <w:t>保守档(¥1/百万,方案基准)</w:t>
             </w:r>
           </w:p>
         </w:tc>
@@ -3249,7 +3263,7 @@
                 <w:b w:val="0"/>
                 <w:sz w:val="21"/>
               </w:rPr>
-              <w:t>大模型 API(日均 5,000 问)</w:t>
+              <w:t>大模型 API(日均 5,000 问,按真实收费价)</w:t>
             </w:r>
           </w:p>
         </w:tc>
@@ -3264,7 +3278,7 @@
                 <w:b w:val="0"/>
                 <w:sz w:val="21"/>
               </w:rPr>
-              <w:t>¥0</w:t>
+              <w:t>¥12–20/月</w:t>
             </w:r>
           </w:p>
         </w:tc>
@@ -3316,7 +3330,7 @@
                 <w:b w:val="0"/>
                 <w:sz w:val="21"/>
               </w:rPr>
-              <w:t>≈¥40/月</w:t>
+              <w:t>≈¥52–60/月</w:t>
             </w:r>
           </w:p>
         </w:tc>
@@ -3367,7 +3381,7 @@
                 <w:b w:val="0"/>
                 <w:sz w:val="21"/>
               </w:rPr>
-              <w:t>≈¥377/月(90%)</w:t>
+              <w:t>≈¥357–365/月(86–88%)</w:t>
             </w:r>
           </w:p>
         </w:tc>
@@ -3404,7 +3418,7 @@
           <w:color w:val="6A7390"/>
           <w:sz w:val="20"/>
         </w:rPr>
-        <w:t>诚实标注:本表仅含直接资源成本,不含人力(实施、维保响应、知识库代运营)与获客成本;3 人团队按兼职运营假设。10 校规模下人力成本被摊薄,模型才真正成立。</w:t>
+        <w:t>诚实标注:两列均为真实收费价口径(免费活动未计入,若免费持续仅是额外安全垫)。本表仅含直接资源成本,不含人力(实施、维保响应、知识库代运营)与获客成本;3 人团队按兼职运营假设,10 校规模下人力成本被摊薄,模型才真正成立。</w:t>
       </w:r>
     </w:p>
     <w:p>
@@ -3433,7 +3447,7 @@
           <w:b w:val="0"/>
           <w:sz w:val="24"/>
         </w:rPr>
-        <w:t>① 免费政策风险:GLM-4-Flash「限时免费」可能终止,已给出收费假设下的敏感性测算与本地降级路径;② 活动价风险:服务器与 GPU 价格引用的是2026-10 新用户活动价/市场区间,续费与量产价更高,采购前以官方页面为准;③ 并发数字口径:44.1 QPS 为 local-extractive 提供者的实测,云端 GLM 模式下吞吐受 API 时延影响,首字延迟取决于网络;④ token 估算为代码静态估算,非线上埋点实测;⑤ 商业定价为课堂假设,未经真实市场验证;⑥ 方案 C 的 GPU 市场存在供应波动,成本与交付周期需预留余量。</w:t>
+        <w:t>① 计价风险:本方案不依赖限时免费活动,按真实收费价核算;若厂商调价,§4.2 三档区间覆盖至 ¥5/百万 token 仍有毛利,且可随时切回本地抽取式生成(¥0),成本存在硬上限;② 活动价风险:服务器与 GPU 价格引用的是2026-10 新用户活动价/市场区间,续费与量产价更高,采购前以官方页面为准;③ 并发数字口径:44.1 QPS 为 local-extractive 提供者的实测,云端 GLM 模式下吞吐受 API 时延影响,首字延迟取决于网络;④ token 估算为代码静态估算,非线上埋点实测;⑤ 商业定价为课堂假设,未经真实市场验证;⑥ 方案 C 的 GPU 市场存在供应波动,成本与交付周期需预留余量。</w:t>
       </w:r>
     </w:p>
     <w:p>
@@ -3461,7 +3475,33 @@
           <w:b w:val="0"/>
           <w:sz w:val="21"/>
         </w:rPr>
-        <w:t>· 智谱开放平台定价页:GLM-4-Flash(128K)限时免费;embedding-3 约 0.5 元/百万 token 档。</w:t>
+        <w:t>· 智谱开放平台:GLM-4-Flash 付费时期历史挂牌价 ¥0.06–0.1/百万 token;</w:t>
+      </w:r>
+    </w:p>
+    <w:p>
+      <w:pPr>
+        <w:spacing w:after="40" w:line="324" w:lineRule="auto"/>
+      </w:pPr>
+      <w:r>
+        <w:rPr>
+          <w:rFonts w:ascii="Times New Roman" w:hAnsi="Times New Roman" w:eastAsia="宋体"/>
+          <w:b w:val="0"/>
+          <w:sz w:val="21"/>
+        </w:rPr>
+        <w:t xml:space="preserve">  当代主力模型公开档位约 ¥1/百万 token;embedding-3 约 0.5 元/百万 token 档。</w:t>
+      </w:r>
+    </w:p>
+    <w:p>
+      <w:pPr>
+        <w:spacing w:after="40" w:line="324" w:lineRule="auto"/>
+      </w:pPr>
+      <w:r>
+        <w:rPr>
+          <w:rFonts w:ascii="Times New Roman" w:hAnsi="Times New Roman" w:eastAsia="宋体"/>
+          <w:b w:val="0"/>
+          <w:sz w:val="21"/>
+        </w:rPr>
+        <w:t xml:space="preserve">  (现行 GLM-4-Flash 限时免费活动未计入本方案,仅如实备注。)</w:t>
       </w:r>
     </w:p>
     <w:p>

</xml_diff>